<commit_message>
License MascotRender and add text placement
</commit_message>
<xml_diff>
--- a/MascotRender_SDD_v0.2.docx
+++ b/MascotRender_SDD_v0.2.docx
@@ -2231,7 +2231,7 @@
           </w:tcPr>
           <w:p>
             <w:r>
-              <w:t>3D rendering, physics, and animation</w:t>
+              <w:t>Filament/GLB rendering, physics, and animation (expansion track)</w:t>
             </w:r>
           </w:p>
         </w:tc>
@@ -5049,6 +5049,70 @@
           <w:p>
             <w:r>
               <w:t>Provide an in-memory render API and a separate Conan test_package that compiles, links, and renders using only packaged artifacts.</w:t>
+            </w:r>
+          </w:p>
+        </w:tc>
+      </w:tr>
+      <w:tr>
+        <w:tc>
+          <w:tcPr>
+            <w:tcW w:type="dxa" w:w="3389"/>
+          </w:tcPr>
+          <w:p>
+            <w:r>
+              <w:t>FR-25</w:t>
+            </w:r>
+          </w:p>
+        </w:tc>
+        <w:tc>
+          <w:tcPr>
+            <w:tcW w:type="dxa" w:w="3389"/>
+          </w:tcPr>
+          <w:p>
+            <w:r>
+              <w:t>MUST</w:t>
+            </w:r>
+          </w:p>
+        </w:tc>
+        <w:tc>
+          <w:tcPr>
+            <w:tcW w:type="dxa" w:w="3389"/>
+          </w:tcPr>
+          <w:p>
+            <w:r>
+              <w:t>Support backward-compatible named text slots, explicit placement, and deterministic preference-based automatic placement.</w:t>
+            </w:r>
+          </w:p>
+        </w:tc>
+      </w:tr>
+      <w:tr>
+        <w:tc>
+          <w:tcPr>
+            <w:tcW w:type="dxa" w:w="3389"/>
+          </w:tcPr>
+          <w:p>
+            <w:r>
+              <w:t>FR-26</w:t>
+            </w:r>
+          </w:p>
+        </w:tc>
+        <w:tc>
+          <w:tcPr>
+            <w:tcW w:type="dxa" w:w="3389"/>
+          </w:tcPr>
+          <w:p>
+            <w:r>
+              <w:t>SHOULD</w:t>
+            </w:r>
+          </w:p>
+        </w:tc>
+        <w:tc>
+          <w:tcPr>
+            <w:tcW w:type="dxa" w:w="3389"/>
+          </w:tcPr>
+          <w:p>
+            <w:r>
+              <w:t>Evolve through a backend-neutral scene graph and typed timeline so static 2D, animated 2D, layered 2.5D, and optional 3D share one semantic recipe.</w:t>
             </w:r>
           </w:p>
         </w:tc>
@@ -17037,7 +17101,7 @@
           </w:tcPr>
           <w:p>
             <w:r>
-              <w:t>Post-pilot</w:t>
+              <w:t>E1</w:t>
             </w:r>
           </w:p>
         </w:tc>
@@ -17055,7 +17119,7 @@
           </w:tcPr>
           <w:p>
             <w:r>
-              <w:t>Animated WebP/APNG/Lottie export from pose keyframes and procedural effects.</w:t>
+              <w:t>Named/automatic text placement, avoid regions, and backend-neutral parented scene nodes.</w:t>
             </w:r>
           </w:p>
         </w:tc>
@@ -17077,7 +17141,7 @@
           </w:tcPr>
           <w:p>
             <w:r>
-              <w:t>Post-pilot</w:t>
+              <w:t>E2</w:t>
             </w:r>
           </w:p>
         </w:tc>
@@ -17094,7 +17158,7 @@
           </w:tcPr>
           <w:p>
             <w:r>
-              <w:t>Additional mascot packs, seasonal themes, category lazy loading, and compact Trie/FST.</w:t>
+              <w:t>Typed timeline, deterministic 2D animation overlays, and animated WebP with a static thumbnail.</w:t>
             </w:r>
           </w:p>
         </w:tc>
@@ -17117,7 +17181,7 @@
           </w:tcPr>
           <w:p>
             <w:r>
-              <w:t>Later</w:t>
+              <w:t>E3</w:t>
             </w:r>
           </w:p>
         </w:tc>
@@ -17135,7 +17199,7 @@
           </w:tcPr>
           <w:p>
             <w:r>
-              <w:t>WASM preview, controlled personalization, and offline ML-assisted trigger expansion.</w:t>
+              <w:t>Layered 2.5D parallax, squash/stretch, shadows, and camera motion on the robot pack.</w:t>
             </w:r>
           </w:p>
         </w:tc>
@@ -17157,7 +17221,7 @@
           </w:tcPr>
           <w:p>
             <w:r>
-              <w:t>Later</w:t>
+              <w:t>E4</w:t>
             </w:r>
           </w:p>
         </w:tc>
@@ -17174,7 +17238,7 @@
           </w:tcPr>
           <w:p>
             <w:r>
-              <w:t>Technical-artist desktop editor built on the same scene graph and schemas.</w:t>
+              <w:t>Optional Filament/GLB robot proof after the scene and timeline contracts stabilize.</w:t>
             </w:r>
           </w:p>
         </w:tc>
@@ -19018,12 +19082,202 @@
     </w:p>
     <w:p>
       <w:r>
-        <w:t>As of 13 July 2026, M0-M4 are implemented locally. The engine renders five deterministic mascot identities and 50 stickers through the C++20 library, with 512px assets, thumbnails, catalogue, dictionary, build report, balanced text, outlined glyphs, and a decoded-pixel golden. The AppleClang Release suite passes 18 tests, and external static/shared Conan consumers pass. The 50-sticker render baseline is 4.84 seconds on the recorded macOS arm64 workstation.</w:t>
+        <w:t>As of 13 July 2026, M0-M4 are implemented locally. The engine renders five deterministic mascot identities and 50 stickers through the C++20 library, with 512px assets, thumbnails, catalogue, dictionary, build report, balanced text, outlined glyphs, and a decoded-pixel golden. The AppleClang Release suite passes 20 tests, and external static/shared Conan consumers pass. The 50-sticker render baseline is 4.84 seconds on the recorded macOS arm64 workstation.</w:t>
       </w:r>
     </w:p>
     <w:p>
       <w:r>
-        <w:t>The remaining M5 release gates are passing hosted GCC, Clang, MSVC, ASan, and UBSan jobs; owner-supplied project license text; and selection plus authentication of a writable Conan remote. Product and Design approval of the complete generated art set remains the independent M6 coherence gate.</w:t>
+        <w:t>The hosted GCC, Clang, MSVC, ASan, and UBSan jobs pass and the project is distributed under the MIT License. The remaining M5 publication gate is selection and authentication of a writable Conan remote. Product and Design approval of the complete generated art set remains the independent M6 coherence gate.</w:t>
+      </w:r>
+    </w:p>
+    <w:p>
+      <w:pPr>
+        <w:pStyle w:val="Heading1"/>
+      </w:pPr>
+      <w:r>
+        <w:t>Appendix F — Scene, Animation, and 3D Expansion</w:t>
+      </w:r>
+    </w:p>
+    <w:p>
+      <w:r>
+        <w:t>MascotRender evolves through one time-sampled, backend-neutral scene contract: sticker recipe to scene compiler, text solver, and typed animation timeline; then ThorVG 2D, layered 2.5D, or optional Filament 3D; then 2D text/effect composition and static or animated WebP encoding. Static rendering is the sample at t = 0 and remains the compatibility baseline.</w:t>
+      </w:r>
+    </w:p>
+    <w:tbl>
+      <w:tblPr>
+        <w:tblStyle w:val="TableGrid"/>
+        <w:tblW w:type="auto" w:w="0"/>
+        <w:tblLook w:firstColumn="1" w:firstRow="1" w:lastColumn="0" w:lastRow="0" w:noHBand="0" w:noVBand="1" w:val="04A0"/>
+      </w:tblPr>
+      <w:tblGrid>
+        <w:gridCol w:w="3389"/>
+        <w:gridCol w:w="3389"/>
+        <w:gridCol w:w="3389"/>
+      </w:tblGrid>
+      <w:tr>
+        <w:tc>
+          <w:tcPr>
+            <w:tcW w:type="dxa" w:w="3389"/>
+          </w:tcPr>
+          <w:p>
+            <w:r>
+              <w:t>Track</w:t>
+            </w:r>
+          </w:p>
+        </w:tc>
+        <w:tc>
+          <w:tcPr>
+            <w:tcW w:type="dxa" w:w="3389"/>
+          </w:tcPr>
+          <w:p>
+            <w:r>
+              <w:t>Deliverable</w:t>
+            </w:r>
+          </w:p>
+        </w:tc>
+        <w:tc>
+          <w:tcPr>
+            <w:tcW w:type="dxa" w:w="3389"/>
+          </w:tcPr>
+          <w:p>
+            <w:r>
+              <w:t>Gate</w:t>
+            </w:r>
+          </w:p>
+        </w:tc>
+      </w:tr>
+      <w:tr>
+        <w:tc>
+          <w:tcPr>
+            <w:tcW w:type="dxa" w:w="3389"/>
+          </w:tcPr>
+          <w:p>
+            <w:r>
+              <w:t>E1</w:t>
+            </w:r>
+          </w:p>
+        </w:tc>
+        <w:tc>
+          <w:tcPr>
+            <w:tcW w:type="dxa" w:w="3389"/>
+          </w:tcPr>
+          <w:p>
+            <w:r>
+              <w:t>Named/auto text slots, avoid regions, parented scene nodes, screen and character anchors</w:t>
+            </w:r>
+          </w:p>
+        </w:tc>
+        <w:tc>
+          <w:tcPr>
+            <w:tcW w:type="dxa" w:w="3389"/>
+          </w:tcPr>
+          <w:p>
+            <w:r>
+              <w:t>Existing static golden remains within tolerance</w:t>
+            </w:r>
+          </w:p>
+        </w:tc>
+      </w:tr>
+      <w:tr>
+        <w:tc>
+          <w:tcPr>
+            <w:tcW w:type="dxa" w:w="3389"/>
+          </w:tcPr>
+          <w:p>
+            <w:r>
+              <w:t>E2</w:t>
+            </w:r>
+          </w:p>
+        </w:tc>
+        <w:tc>
+          <w:tcPr>
+            <w:tcW w:type="dxa" w:w="3389"/>
+          </w:tcPr>
+          <w:p>
+            <w:r>
+              <w:t>Keyframes, easing, overlays, deterministic frame sampling, animated WebP</w:t>
+            </w:r>
+          </w:p>
+        </w:tc>
+        <w:tc>
+          <w:tcPr>
+            <w:tcW w:type="dxa" w:w="3389"/>
+          </w:tcPr>
+          <w:p>
+            <w:r>
+              <w:t>One current mascot animates with stable text placement</w:t>
+            </w:r>
+          </w:p>
+        </w:tc>
+      </w:tr>
+      <w:tr>
+        <w:tc>
+          <w:tcPr>
+            <w:tcW w:type="dxa" w:w="3389"/>
+          </w:tcPr>
+          <w:p>
+            <w:r>
+              <w:t>E3</w:t>
+            </w:r>
+          </w:p>
+        </w:tc>
+        <w:tc>
+          <w:tcPr>
+            <w:tcW w:type="dxa" w:w="3389"/>
+          </w:tcPr>
+          <w:p>
+            <w:r>
+              <w:t>Layered 2.5D depth, parallax, squash/stretch, shadows, camera motion</w:t>
+            </w:r>
+          </w:p>
+        </w:tc>
+        <w:tc>
+          <w:tcPr>
+            <w:tcW w:type="dxa" w:w="3389"/>
+          </w:tcPr>
+          <w:p>
+            <w:r>
+              <w:t>Robot 2.5D animation golden passes</w:t>
+            </w:r>
+          </w:p>
+        </w:tc>
+      </w:tr>
+      <w:tr>
+        <w:tc>
+          <w:tcPr>
+            <w:tcW w:type="dxa" w:w="3389"/>
+          </w:tcPr>
+          <w:p>
+            <w:r>
+              <w:t>E4</w:t>
+            </w:r>
+          </w:p>
+        </w:tc>
+        <w:tc>
+          <w:tcPr>
+            <w:tcW w:type="dxa" w:w="3389"/>
+          </w:tcPr>
+          <w:p>
+            <w:r>
+              <w:t>Optional Filament backend and one semantic GLB robot contract</w:t>
+            </w:r>
+          </w:p>
+        </w:tc>
+        <w:tc>
+          <w:tcPr>
+            <w:tcW w:type="dxa" w:w="3389"/>
+          </w:tcPr>
+          <w:p>
+            <w:r>
+              <w:t>Same recipe renders in 2D, 2.5D, and 3D</w:t>
+            </w:r>
+          </w:p>
+        </w:tc>
+      </w:tr>
+    </w:tbl>
+    <w:p>
+      <w:r>
+        <w:t>Filament is not added before the scene and timeline tests pass. The normal Conan package remains free of 3D dependencies unless the consumer enables the feature. Blender is an offline authoring/validation tool, GLB/glTF 2.0 is the exchange format, and product clients consume pre-rendered animated WebP rather than embedding the 3D runtime.</w:t>
       </w:r>
     </w:p>
     <w:sectPr>

</xml_diff>

<commit_message>
Add deterministic 2D animation pipeline
</commit_message>
<xml_diff>
--- a/MascotRender_SDD_v0.2.docx
+++ b/MascotRender_SDD_v0.2.docx
@@ -1423,7 +1423,7 @@
             <w:r>
               <w:t>Recommended delivery boundary</w:t>
               <w:br/>
-              <w:t>M0-M5 deliver an installable build-time C++20 engine. M6 validates a 50-sticker art system. M7 delivers the approximately 200-sticker product pilot and runtime integration. CSV, full multilingual shaping, incremental builds, OpenCV QA, animation, Drogon, and React do not block engine 0.1.0.</w:t>
+              <w:t>M0-M5 deliver an installable build-time C++20 engine. M6 validates a 50-sticker art system. M7 delivers the approximately 200-sticker product pilot and runtime integration. CSV, full multilingual shaping, incremental builds, OpenCV QA, advanced authored animation, 2.5D/3D, Drogon, and React do not block engine 0.1.0.</w:t>
             </w:r>
           </w:p>
         </w:tc>
@@ -2231,7 +2231,7 @@
           </w:tcPr>
           <w:p>
             <w:r>
-              <w:t>Filament/GLB rendering, physics, and animation (expansion track)</w:t>
+              <w:t>Filament/GLB rendering, skeletal animation, physics, and layered 2.5D (expansion track)</w:t>
             </w:r>
           </w:p>
         </w:tc>
@@ -5113,6 +5113,38 @@
           <w:p>
             <w:r>
               <w:t>Evolve through a backend-neutral scene graph and typed timeline so static 2D, animated 2D, layered 2.5D, and optional 3D share one semantic recipe.</w:t>
+            </w:r>
+          </w:p>
+        </w:tc>
+      </w:tr>
+      <w:tr>
+        <w:tc>
+          <w:tcPr>
+            <w:tcW w:type="dxa" w:w="3389"/>
+          </w:tcPr>
+          <w:p>
+            <w:r>
+              <w:t>FR-27</w:t>
+            </w:r>
+          </w:p>
+        </w:tc>
+        <w:tc>
+          <w:tcPr>
+            <w:tcW w:type="dxa" w:w="3389"/>
+          </w:tcPr>
+          <w:p>
+            <w:r>
+              <w:t>SHOULD</w:t>
+            </w:r>
+          </w:p>
+        </w:tc>
+        <w:tc>
+          <w:tcPr>
+            <w:tcW w:type="dxa" w:w="3389"/>
+          </w:tcPr>
+          <w:p>
+            <w:r>
+              <w:t>Render bounded deterministic body-bounce and text-pop overlays to animated WebP while retaining a static poster mode for thumbnails and non-animated consumers.</w:t>
             </w:r>
           </w:p>
         </w:tc>
@@ -6706,7 +6738,7 @@
           </w:tcPr>
           <w:p>
             <w:r>
-              <w:t>Direct control of alpha and explicit deterministic encoding settings.</w:t>
+              <w:t>Direct control of alpha and explicit deterministic static and animated encoding settings.</w:t>
             </w:r>
           </w:p>
         </w:tc>
@@ -19082,7 +19114,7 @@
     </w:p>
     <w:p>
       <w:r>
-        <w:t>As of 13 July 2026, M0-M4 are implemented locally. The engine renders five deterministic mascot identities and 50 stickers through the C++20 library, with 512px assets, thumbnails, catalogue, dictionary, build report, balanced text, outlined glyphs, and a decoded-pixel golden. The AppleClang Release suite passes 20 tests, and external static/shared Conan consumers pass. The 50-sticker render baseline is 4.84 seconds on the recorded macOS arm64 workstation.</w:t>
+        <w:t>As of 13 July 2026, M0-M4 are implemented locally. The engine renders five deterministic mascot identities and 50 stickers through the C++20 library, with 512px assets, thumbnails, catalogue, dictionary, build report, balanced text, outlined glyphs, avoid-aware text placement, bounded 2D timelines, animated WebP, static poster thumbnails, and a decoded-pixel golden. The AppleClang Release suite passes 24 tests, and external static/shared Conan consumers pass. The 50-sticker render baseline is 6.21 seconds, including 20 animated primary assets and 50 static poster thumbnails, on the recorded macOS arm64 workstation.</w:t>
       </w:r>
     </w:p>
     <w:p>
@@ -19101,6 +19133,11 @@
     <w:p>
       <w:r>
         <w:t>MascotRender evolves through one time-sampled, backend-neutral scene contract: sticker recipe to scene compiler, text solver, and typed animation timeline; then ThorVG 2D, layered 2.5D, or optional Filament 3D; then 2D text/effect composition and static or animated WebP encoding. Static rendering is the sample at t = 0 and remains the compatibility baseline.</w:t>
+      </w:r>
+    </w:p>
+    <w:p>
+      <w:r>
+        <w:t>The first E1/E2 vertical slice is implemented: authored rectangle avoid regions, deterministic collision scoring, bounded frame sampling, body-bounce and text-pop overlays, animated WebP, and stable static poster rendering. Parented nodes, animation-wide alpha occupancy, blink, sparkle, and layered 2.5D remain follow-up work.</w:t>
       </w:r>
     </w:p>
     <w:tbl>

</xml_diff>

<commit_message>
Ship Human Pack v1 production pipeline
</commit_message>
<xml_diff>
--- a/MascotRender_SDD_v0.2.docx
+++ b/MascotRender_SDD_v0.2.docx
@@ -19315,6 +19315,67 @@
     <w:p>
       <w:r>
         <w:t>Filament is not added before the scene and timeline tests pass. The normal Conan package remains free of 3D dependencies unless the consumer enables the feature. Blender is an offline authoring/validation tool, GLB/glTF 2.0 is the exchange format, and product clients consume pre-rendered animated WebP rather than embedding the 3D runtime.</w:t>
+      </w:r>
+    </w:p>
+    <w:p>
+      <w:pPr>
+        <w:pStyle w:val="Heading1"/>
+      </w:pPr>
+      <w:r>
+        <w:t>Appendix G — Human Mascot Identity and Representation</w:t>
+      </w:r>
+    </w:p>
+    <w:p>
+      <w:r>
+        <w:t>Human mascots use a versioned appearance contract rather than a race enum. Complexion tone/undertone/material, normalized face profiles, hair texture and style, body proportions, clothing, and accessories are independent. Heritage context is audit-only metadata and cannot drive rendering geometry.</w:t>
+      </w:r>
+    </w:p>
+    <w:p>
+      <w:r>
+        <w:t>The humanoid-full-body-v1 contract defines parented joints, pivots, semantic targets, capabilities, and face-closeup, bust, three-quarter, full-body, and dynamic-full-body camera framings. Recipes compile semantic gestures to selected concrete layers; captions stay screen-fixed and collision-aware.</w:t>
+      </w:r>
+    </w:p>
+    <w:p>
+      <w:r>
+        <w:t>The first technical pilot contains 12 synthetic identities and 12 core phrases, producing 144 deterministic sticker specifications and one contact sheet per phrase. The procedural set is permanently classified as a technical fixture with production use forbidden; automated success cannot promote it to approved Human Pack artwork. Scaling uses a shared phrase Trie plus core, extended, and on-demand asset tiers rather than precomputing every combination.</w:t>
+      </w:r>
+    </w:p>
+    <w:p>
+      <w:r>
+        <w:t>The owner-supplied Human Mascot Reference dated 2026-07-15 is the visual and capability benchmark for original Human Pack v1 artwork. The production standard lists supported identity dimensions while each pack owns its editorial coverage; minor-coded characters are optional and require an explicit owner decision. It gates five camera framings; 80/96/100-pixel readability; provenance; reduced-motion behavior; diverse human review; and cross-backend identity parity. Heritage metadata remains audit-only.</w:t>
+      </w:r>
+    </w:p>
+    <w:p>
+      <w:r>
+        <w:t>On 2026-07-15 the project owner approved the original H01, H04, H07, H12, and H13 concept lineup as the initial canonical family and foundation for the Human Character Library. The versioned family contract pins the exact concept digest, approval, visual language, anatomical principles, and prosthesis, manual wheelchair, hearing-aid, and rollator requirements. This establishes rules for future characters but is explicitly not the complete library or a production rig.</w:t>
+      </w:r>
+    </w:p>
+    <w:p>
+      <w:r>
+        <w:t>The approved front-facing five now have deterministic semantic SVG candidates with 176 separate anatomy and assistive-device layers, five 512-pixel camera framings per identity, and a production-v2 22-joint humanoid rig. Prosthesis, manual wheelchair, hearing-aid, and rollator components are addressable rig parts rather than flattened decoration. Anatomical left/right is character-local, so character-right projects to screen-left in an unmirrored front view. All 25 posters validate through the C++ engine. Nine review sheets additionally prove a common world scale, true 80/96/100-pixel output, 19 isolated device parts, labeled anchors/pivots/contacts, and four animated device checks. The renderer selects 12 authored low-LOD layers for the four device users. On 2026-07-15 the project owner approved vector identity parity for all five members, explicitly including H07's seated geometry and footrest relationship. The technical pipeline emits 20 turnaround images, 35 expression/pose renders, 35 reduced-motion equivalents, five semantic GLBs, and 80 Filament clip renders. On 2026-07-15 the project owner rejected those production sheets: side-view hair detaches, whole-character rotation and device topology are incomplete, required pose evidence is missing, dimensional 2.5D behavior is unproven, and the primitive GLBs do not preserve authored identity or assistive-device geometry. Technical validation therefore succeeds while production use remains forbidden. A future candidate requires a new owner design decision bound to the regenerated sheet hashes.</w:t>
+      </w:r>
+    </w:p>
+    <w:p>
+      <w:pPr>
+        <w:pStyle w:val="Heading1"/>
+      </w:pPr>
+      <w:r>
+        <w:t>Appendix H — Independent Platform and Portable Packages</w:t>
+      </w:r>
+    </w:p>
+    <w:p>
+      <w:r>
+        <w:t>MascotRender is an independent open-source procedural character rendering engine. Wahalao is its flagship consumer rather than its architectural boundary. The stable conceptual input is Character + Semantic Recipe + Camera + Output Configuration; compilation resolves those inputs to a scene graph and sampled timeline consumed by vector, layered, or optional GLB backends.</w:t>
+      </w:r>
+    </w:p>
+    <w:p>
+      <w:r>
+        <w:t>Core, vector, layered, GLB, animation, text, CLI, and authoring boundaries begin as CMake targets and later Conan components in one repository. Repository splits are deferred until APIs and independent release cadences stabilize. Character packs are independently versioned and explicitly licensed.</w:t>
+      </w:r>
+    </w:p>
+    <w:p>
+      <w:r>
+        <w:t>The draft .mascot v1 authoring format is a deterministic ZIP-compatible container with a root manifest, safe sorted paths, fixed metadata, SHA-256 declarations, capabilities, provenance, and licenses. This does not expand the 0.1 trust boundary: engine loading begins only after a bounded package loader and capability validation API are implemented and security tested.</w:t>
       </w:r>
     </w:p>
     <w:sectPr>

</xml_diff>

<commit_message>
Ship Human Pack v1 production pipeline (#30)
* Ship Human Pack v1 production pipeline

* Fix human pack CI dependencies

* Make human review CI cross-platform
</commit_message>
<xml_diff>
--- a/MascotRender_SDD_v0.2.docx
+++ b/MascotRender_SDD_v0.2.docx
@@ -19315,6 +19315,67 @@
     <w:p>
       <w:r>
         <w:t>Filament is not added before the scene and timeline tests pass. The normal Conan package remains free of 3D dependencies unless the consumer enables the feature. Blender is an offline authoring/validation tool, GLB/glTF 2.0 is the exchange format, and product clients consume pre-rendered animated WebP rather than embedding the 3D runtime.</w:t>
+      </w:r>
+    </w:p>
+    <w:p>
+      <w:pPr>
+        <w:pStyle w:val="Heading1"/>
+      </w:pPr>
+      <w:r>
+        <w:t>Appendix G — Human Mascot Identity and Representation</w:t>
+      </w:r>
+    </w:p>
+    <w:p>
+      <w:r>
+        <w:t>Human mascots use a versioned appearance contract rather than a race enum. Complexion tone/undertone/material, normalized face profiles, hair texture and style, body proportions, clothing, and accessories are independent. Heritage context is audit-only metadata and cannot drive rendering geometry.</w:t>
+      </w:r>
+    </w:p>
+    <w:p>
+      <w:r>
+        <w:t>The humanoid-full-body-v1 contract defines parented joints, pivots, semantic targets, capabilities, and face-closeup, bust, three-quarter, full-body, and dynamic-full-body camera framings. Recipes compile semantic gestures to selected concrete layers; captions stay screen-fixed and collision-aware.</w:t>
+      </w:r>
+    </w:p>
+    <w:p>
+      <w:r>
+        <w:t>The first technical pilot contains 12 synthetic identities and 12 core phrases, producing 144 deterministic sticker specifications and one contact sheet per phrase. The procedural set is permanently classified as a technical fixture with production use forbidden; automated success cannot promote it to approved Human Pack artwork. Scaling uses a shared phrase Trie plus core, extended, and on-demand asset tiers rather than precomputing every combination.</w:t>
+      </w:r>
+    </w:p>
+    <w:p>
+      <w:r>
+        <w:t>The owner-supplied Human Mascot Reference dated 2026-07-15 is the visual and capability benchmark for original Human Pack v1 artwork. The production standard lists supported identity dimensions while each pack owns its editorial coverage; minor-coded characters are optional and require an explicit owner decision. It gates five camera framings; 80/96/100-pixel readability; provenance; reduced-motion behavior; diverse human review; and cross-backend identity parity. Heritage metadata remains audit-only.</w:t>
+      </w:r>
+    </w:p>
+    <w:p>
+      <w:r>
+        <w:t>On 2026-07-15 the project owner approved the original H01, H04, H07, H12, and H13 concept lineup as the initial canonical family and foundation for the Human Character Library. The versioned family contract pins the exact concept digest, approval, visual language, anatomical principles, and prosthesis, manual wheelchair, hearing-aid, and rollator requirements. This establishes rules for future characters but is explicitly not the complete library or a production rig.</w:t>
+      </w:r>
+    </w:p>
+    <w:p>
+      <w:r>
+        <w:t>The approved front-facing five now have deterministic semantic SVG candidates with 176 separate anatomy and assistive-device layers, five 512-pixel camera framings per identity, and a production-v2 22-joint humanoid rig. Prosthesis, manual wheelchair, hearing-aid, and rollator components are addressable rig parts rather than flattened decoration. Anatomical left/right is character-local, so character-right projects to screen-left in an unmirrored front view. All 25 posters validate through the C++ engine. Nine review sheets additionally prove a common world scale, true 80/96/100-pixel output, 19 isolated device parts, labeled anchors/pivots/contacts, and four animated device checks. The renderer selects 12 authored low-LOD layers for the four device users. On 2026-07-15 the project owner approved vector identity parity for all five members, explicitly including H07's seated geometry and footrest relationship. The technical pipeline emits 20 turnaround images, 35 expression/pose renders, 35 reduced-motion equivalents, five semantic GLBs, and 80 Filament clip renders. On 2026-07-15 the project owner rejected those production sheets: side-view hair detaches, whole-character rotation and device topology are incomplete, required pose evidence is missing, dimensional 2.5D behavior is unproven, and the primitive GLBs do not preserve authored identity or assistive-device geometry. Technical validation therefore succeeds while production use remains forbidden. A future candidate requires a new owner design decision bound to the regenerated sheet hashes.</w:t>
+      </w:r>
+    </w:p>
+    <w:p>
+      <w:pPr>
+        <w:pStyle w:val="Heading1"/>
+      </w:pPr>
+      <w:r>
+        <w:t>Appendix H — Independent Platform and Portable Packages</w:t>
+      </w:r>
+    </w:p>
+    <w:p>
+      <w:r>
+        <w:t>MascotRender is an independent open-source procedural character rendering engine. Wahalao is its flagship consumer rather than its architectural boundary. The stable conceptual input is Character + Semantic Recipe + Camera + Output Configuration; compilation resolves those inputs to a scene graph and sampled timeline consumed by vector, layered, or optional GLB backends.</w:t>
+      </w:r>
+    </w:p>
+    <w:p>
+      <w:r>
+        <w:t>Core, vector, layered, GLB, animation, text, CLI, and authoring boundaries begin as CMake targets and later Conan components in one repository. Repository splits are deferred until APIs and independent release cadences stabilize. Character packs are independently versioned and explicitly licensed.</w:t>
+      </w:r>
+    </w:p>
+    <w:p>
+      <w:r>
+        <w:t>The draft .mascot v1 authoring format is a deterministic ZIP-compatible container with a root manifest, safe sorted paths, fixed metadata, SHA-256 declarations, capabilities, provenance, and licenses. This does not expand the 0.1 trust boundary: engine loading begins only after a bounded package loader and capability validation API are implemented and security tested.</w:t>
       </w:r>
     </w:p>
     <w:sectPr>

</xml_diff>